<commit_message>
Add author/affiliation front matter to JCMDS manuscript (desk-reject fix)
Co-Authored-By: Tatsuki Onishi <bougtoir@gmail.com>
</commit_message>
<xml_diff>
--- a/results/manuscript/jcmds_submission/IONE_jcmds_v1.docx
+++ b/results/manuscript/jcmds_submission/IONE_jcmds_v1.docx
@@ -9,6 +9,61 @@
       </w:pPr>
       <w:r>
         <w:t>Coherence diagnostics for hidden effect modification in individual participant data meta-analysis: the Incoherence-Oriented Neutralisation and Extraction (IONE) framework and a simulation benchmark</w:t>
+      </w:r>
+    </w:p>
+    <w:p>
+      <w:pPr>
+        <w:jc w:val="center"/>
+      </w:pPr>
+      <w:r>
+        <w:t>Onishi Tatsuki</w:t>
+      </w:r>
+      <w:r>
+        <w:rPr>
+          <w:vertAlign w:val="superscript"/>
+        </w:rPr>
+        <w:t>a</w:t>
+      </w:r>
+    </w:p>
+    <w:p>
+      <w:pPr>
+        <w:jc w:val="center"/>
+      </w:pPr>
+      <w:r>
+        <w:rPr>
+          <w:vertAlign w:val="superscript"/>
+        </w:rPr>
+        <w:t>a</w:t>
+      </w:r>
+      <w:r>
+        <w:t>Data Science AI Innovation Research Promotion Center, Shiga University, 1-1-1 Bamba, Hikone, Shiga 522-8522, Japan</w:t>
+      </w:r>
+    </w:p>
+    <w:p>
+      <w:pPr>
+        <w:jc w:val="center"/>
+      </w:pPr>
+      <w:r>
+        <w:t>ORCID: 0000-0001-7261-9062</w:t>
+      </w:r>
+    </w:p>
+    <w:p>
+      <w:pPr>
+        <w:jc w:val="center"/>
+      </w:pPr>
+      <w:r>
+        <w:t>Corresponding author: Onishi Tatsuki</w:t>
+      </w:r>
+    </w:p>
+    <w:p>
+      <w:pPr>
+        <w:jc w:val="center"/>
+      </w:pPr>
+      <w:r>
+        <w:rPr>
+          <w:i/>
+        </w:rPr>
+        <w:t>bougtoir@gmail.com</w:t>
       </w:r>
     </w:p>
     <w:p>

</xml_diff>